<commit_message>
update week 6 presentation and pipline
</commit_message>
<xml_diff>
--- a/Pipline.docx
+++ b/Pipline.docx
@@ -566,6 +566,42 @@
     </w:p>
     <w:p>
       <w:pPr>
+        <w:pStyle w:val="ListParagraph"/>
+        <w:numPr>
+          <w:ilvl w:val="0"/>
+          <w:numId w:val="1"/>
+        </w:numPr>
+        <w:spacing w:after="0" w:line="240" w:lineRule="auto"/>
+        <w:rPr>
+          <w:rFonts w:ascii="Times New Roman" w:eastAsia="Times New Roman" w:hAnsi="Times New Roman" w:cs="Times New Roman"/>
+          <w:sz w:val="24"/>
+          <w:szCs w:val="24"/>
+          <w:lang w:val="en-US" w:eastAsia="fr-FR" w:bidi="ar-SA"/>
+        </w:rPr>
+      </w:pPr>
+      <w:r>
+        <w:rPr>
+          <w:rFonts w:ascii="Times New Roman" w:eastAsia="Times New Roman" w:hAnsi="Times New Roman" w:cs="Times New Roman"/>
+          <w:b/>
+          <w:bCs/>
+          <w:sz w:val="24"/>
+          <w:szCs w:val="24"/>
+          <w:lang w:val="en-US" w:eastAsia="fr-FR" w:bidi="ar-SA"/>
+        </w:rPr>
+        <w:t>Dual-Sided AI Match Alerts:</w:t>
+      </w:r>
+      <w:r>
+        <w:rPr>
+          <w:rFonts w:ascii="Times New Roman" w:eastAsia="Times New Roman" w:hAnsi="Times New Roman" w:cs="Times New Roman"/>
+          <w:sz w:val="24"/>
+          <w:szCs w:val="24"/>
+          <w:lang w:val="en-US" w:eastAsia="fr-FR" w:bidi="ar-SA"/>
+        </w:rPr>
+        <w:t xml:space="preserve"> Implementing a real-time notification system that informs both parties of potential matches, specifically providing Freelancers with a visual Compatibility Score to assess their alignment with mission requirements.</w:t>
+      </w:r>
+    </w:p>
+    <w:p>
+      <w:pPr>
         <w:numPr>
           <w:ilvl w:val="0"/>
           <w:numId w:val="1"/>
@@ -769,10 +805,12 @@
         <w:spacing w:before="100" w:beforeAutospacing="1" w:after="100" w:afterAutospacing="1" w:line="240" w:lineRule="auto"/>
         <w:ind w:left="720"/>
         <w:rPr>
-          <w:rFonts w:ascii="Times New Roman" w:eastAsia="Times New Roman" w:hAnsi="Times New Roman" w:cs="Times New Roman"/>
-          <w:sz w:val="24"/>
-          <w:szCs w:val="24"/>
-          <w:lang w:val="en-CA" w:eastAsia="fr-FR" w:bidi="ar-SA"/>
+          <w:b/>
+          <w:bCs/>
+          <w:color w:val="000000" w:themeColor="text1"/>
+          <w:sz w:val="32"/>
+          <w:szCs w:val="32"/>
+          <w:lang w:val="en-CA" w:bidi="ar-SA"/>
         </w:rPr>
       </w:pPr>
     </w:p>
@@ -803,6 +841,7 @@
           <w:szCs w:val="32"/>
           <w:lang w:val="en-CA"/>
         </w:rPr>
+        <w:lastRenderedPageBreak/>
         <w:t xml:space="preserve"> This phase covers the </w:t>
       </w:r>
       <w:r>
@@ -821,16 +860,7 @@
           <w:szCs w:val="32"/>
           <w:lang w:val="en-CA"/>
         </w:rPr>
-        <w:t xml:space="preserve"> period of the mission. It is the "Engine Room" of the platform, where raw work is transformed into measurable data. By combining real-time time tracking with deep AI </w:t>
-      </w:r>
-      <w:r>
-        <w:rPr>
-          <w:sz w:val="32"/>
-          <w:szCs w:val="32"/>
-          <w:lang w:val="en-CA"/>
-        </w:rPr>
-        <w:lastRenderedPageBreak/>
-        <w:t>behavioral analysis, this phase ensures maximum productivity. It doesn't just monitor work; it analyzes patterns to provide predictive forecasting and constant performance updates, making the workflow transparent, secure, and highly efficient.</w:t>
+        <w:t xml:space="preserve"> period of the mission. It is the "Engine Room" of the platform, where raw work is transformed into measurable data. By combining real-time time tracking with deep AI behavioral analysis, this phase ensures maximum productivity. It doesn't just monitor work; it analyzes patterns to provide predictive forecasting and constant performance updates, making the workflow transparent, secure, and highly efficient.</w:t>
       </w:r>
     </w:p>
     <w:p>
@@ -1389,6 +1419,7 @@
           <w:szCs w:val="32"/>
           <w:lang w:val="en-CA"/>
         </w:rPr>
+        <w:lastRenderedPageBreak/>
         <w:t>This phase manages the "</w:t>
       </w:r>
       <w:r>
@@ -1428,7 +1459,6 @@
           <w:bCs/>
           <w:lang w:val="en-CA"/>
         </w:rPr>
-        <w:lastRenderedPageBreak/>
         <w:t>Startups can Edit / Close Mission:</w:t>
       </w:r>
       <w:r>

</xml_diff>